<commit_message>
Align CSE 3252 COs with BAETE taxonomy
- CO1: construct (Psychomotor L4), PO5
- CO3: use Postman, Git, and Docker (Psychomotor L4), PO5
- CO2 unchanged (Cognitive L6, PO3)
- Markdown assessment split updated to 30/60/10 to match the final draft
</commit_message>
<xml_diff>
--- a/58-CSE 3252_U.docx
+++ b/58-CSE 3252_U.docx
@@ -913,7 +913,7 @@
                 <w:sz w:val="18"/>
                 <w:szCs w:val="18"/>
               </w:rPr>
-              <w:t>build</w:t>
+              <w:t>construct</w:t>
             </w:r>
             <w:r>
               <w:rPr>
@@ -1054,7 +1054,7 @@
                 <w:sz w:val="18"/>
                 <w:szCs w:val="18"/>
               </w:rPr>
-              <w:t>Cognitive domain</w:t>
+              <w:t>Psychomotor domain</w:t>
             </w:r>
           </w:p>
           <w:p>
@@ -1072,7 +1072,7 @@
                 <w:sz w:val="18"/>
                 <w:szCs w:val="18"/>
               </w:rPr>
-              <w:t>– Level 6</w:t>
+              <w:t>– Level 4</w:t>
             </w:r>
           </w:p>
         </w:tc>
@@ -2303,15 +2303,15 @@
                 <w:sz w:val="18"/>
                 <w:szCs w:val="18"/>
               </w:rPr>
-              <w:t>test</w:t>
-            </w:r>
-            <w:r>
-              <w:rPr>
-                <w:rFonts w:ascii="Arial" w:hAnsi="Arial" w:cs="Arial"/>
-                <w:sz w:val="18"/>
-                <w:szCs w:val="18"/>
-              </w:rPr>
-              <w:t xml:space="preserve"> and </w:t>
+              <w:t>use</w:t>
+            </w:r>
+            <w:r>
+              <w:rPr>
+                <w:rFonts w:ascii="Arial" w:hAnsi="Arial" w:cs="Arial"/>
+                <w:sz w:val="18"/>
+                <w:szCs w:val="18"/>
+              </w:rPr>
+              <w:t xml:space="preserve"> Postman, Git, and Docker to test, version, and containerize secure web applications</w:t>
             </w:r>
             <w:r>
               <w:rPr>
@@ -2320,15 +2320,15 @@
                 <w:sz w:val="18"/>
                 <w:szCs w:val="18"/>
               </w:rPr>
-              <w:t>package</w:t>
-            </w:r>
-            <w:r>
-              <w:rPr>
-                <w:rFonts w:ascii="Arial" w:hAnsi="Arial" w:cs="Arial"/>
-                <w:sz w:val="18"/>
-                <w:szCs w:val="18"/>
-              </w:rPr>
-              <w:t xml:space="preserve"> secure web applications using Postman, </w:t>
+              <w:t/>
+            </w:r>
+            <w:r>
+              <w:rPr>
+                <w:rFonts w:ascii="Arial" w:hAnsi="Arial" w:cs="Arial"/>
+                <w:sz w:val="18"/>
+                <w:szCs w:val="18"/>
+              </w:rPr>
+              <w:t xml:space="preserve"/>
             </w:r>
             <w:proofErr w:type="spellStart"/>
             <w:r>
@@ -2337,7 +2337,7 @@
                 <w:sz w:val="18"/>
                 <w:szCs w:val="18"/>
               </w:rPr>
-              <w:t>Git</w:t>
+              <w:t/>
             </w:r>
             <w:proofErr w:type="spellEnd"/>
             <w:r>
@@ -2346,7 +2346,7 @@
                 <w:sz w:val="18"/>
                 <w:szCs w:val="18"/>
               </w:rPr>
-              <w:t xml:space="preserve">, </w:t>
+              <w:t xml:space="preserve"/>
             </w:r>
             <w:proofErr w:type="spellStart"/>
             <w:r>
@@ -2355,7 +2355,7 @@
                 <w:sz w:val="18"/>
                 <w:szCs w:val="18"/>
               </w:rPr>
-              <w:t>Docker</w:t>
+              <w:t/>
             </w:r>
             <w:proofErr w:type="spellEnd"/>
             <w:r>
@@ -2364,7 +2364,7 @@
                 <w:sz w:val="18"/>
                 <w:szCs w:val="18"/>
               </w:rPr>
-              <w:t xml:space="preserve">, and modern framework </w:t>
+              <w:t xml:space="preserve"/>
             </w:r>
             <w:proofErr w:type="spellStart"/>
             <w:r>
@@ -2373,7 +2373,7 @@
                 <w:sz w:val="18"/>
                 <w:szCs w:val="18"/>
               </w:rPr>
-              <w:t>toolchains</w:t>
+              <w:t/>
             </w:r>
             <w:proofErr w:type="spellEnd"/>
           </w:p>
@@ -2489,7 +2489,7 @@
                 <w:sz w:val="18"/>
                 <w:szCs w:val="18"/>
               </w:rPr>
-              <w:t>Cognitive domain</w:t>
+              <w:t>Psychomotor domain</w:t>
             </w:r>
           </w:p>
           <w:p>
@@ -2507,7 +2507,7 @@
                 <w:sz w:val="18"/>
                 <w:szCs w:val="18"/>
               </w:rPr>
-              <w:t>– Level 6</w:t>
+              <w:t>– Level 4</w:t>
             </w:r>
           </w:p>
         </w:tc>

</xml_diff>

<commit_message>
Condense CSE 3252 final draft for print
- Keep only lab headings; remove per-lab detail bullets and capstone requirements
- Clarify headings for Labs 2-6 and 10 so key tools and topics remain visible
- Remove Recommended Resources section
The markdown copy keeps the full detail for in-class distribution.
</commit_message>
<xml_diff>
--- a/58-CSE 3252_U.docx
+++ b/58-CSE 3252_U.docx
@@ -3145,138 +3145,6 @@
     </w:p>
     <w:p>
       <w:pPr>
-        <w:pStyle w:val="ListParagraph"/>
-        <w:numPr>
-          <w:ilvl w:val="0"/>
-          <w:numId w:val="3"/>
-        </w:numPr>
-        <w:rPr>
-          <w:rFonts w:ascii="Arial" w:hAnsi="Arial" w:cs="Arial"/>
-          <w:bCs/>
-          <w:sz w:val="18"/>
-          <w:szCs w:val="18"/>
-        </w:rPr>
-      </w:pPr>
-      <w:r>
-        <w:rPr>
-          <w:rFonts w:ascii="Arial" w:hAnsi="Arial" w:cs="Arial"/>
-          <w:bCs/>
-          <w:sz w:val="18"/>
-          <w:szCs w:val="18"/>
-        </w:rPr>
-        <w:t>Install and configure Node.js, Composer, PHP, MySQL/</w:t>
-      </w:r>
-      <w:proofErr w:type="spellStart"/>
-      <w:r>
-        <w:rPr>
-          <w:rFonts w:ascii="Arial" w:hAnsi="Arial" w:cs="Arial"/>
-          <w:bCs/>
-          <w:sz w:val="18"/>
-          <w:szCs w:val="18"/>
-        </w:rPr>
-        <w:t>PostgreSQL</w:t>
-      </w:r>
-      <w:proofErr w:type="spellEnd"/>
-      <w:r>
-        <w:rPr>
-          <w:rFonts w:ascii="Arial" w:hAnsi="Arial" w:cs="Arial"/>
-          <w:bCs/>
-          <w:sz w:val="18"/>
-          <w:szCs w:val="18"/>
-        </w:rPr>
-        <w:t xml:space="preserve">, Postman, and </w:t>
-      </w:r>
-      <w:proofErr w:type="spellStart"/>
-      <w:r>
-        <w:rPr>
-          <w:rFonts w:ascii="Arial" w:hAnsi="Arial" w:cs="Arial"/>
-          <w:bCs/>
-          <w:sz w:val="18"/>
-          <w:szCs w:val="18"/>
-        </w:rPr>
-        <w:t>Docker</w:t>
-      </w:r>
-      <w:proofErr w:type="spellEnd"/>
-      <w:r>
-        <w:rPr>
-          <w:rFonts w:ascii="Arial" w:hAnsi="Arial" w:cs="Arial"/>
-          <w:bCs/>
-          <w:sz w:val="18"/>
-          <w:szCs w:val="18"/>
-        </w:rPr>
-        <w:t xml:space="preserve"> Desktop</w:t>
-      </w:r>
-    </w:p>
-    <w:p>
-      <w:pPr>
-        <w:pStyle w:val="ListParagraph"/>
-        <w:numPr>
-          <w:ilvl w:val="0"/>
-          <w:numId w:val="3"/>
-        </w:numPr>
-        <w:rPr>
-          <w:rFonts w:ascii="Arial" w:hAnsi="Arial" w:cs="Arial"/>
-          <w:bCs/>
-          <w:sz w:val="18"/>
-          <w:szCs w:val="18"/>
-        </w:rPr>
-      </w:pPr>
-      <w:r>
-        <w:rPr>
-          <w:rFonts w:ascii="Arial" w:hAnsi="Arial" w:cs="Arial"/>
-          <w:bCs/>
-          <w:sz w:val="18"/>
-          <w:szCs w:val="18"/>
-        </w:rPr>
-        <w:t xml:space="preserve">Create a React frontend with </w:t>
-      </w:r>
-      <w:proofErr w:type="spellStart"/>
-      <w:r>
-        <w:rPr>
-          <w:rFonts w:ascii="Arial" w:hAnsi="Arial" w:cs="Arial"/>
-          <w:bCs/>
-          <w:sz w:val="18"/>
-          <w:szCs w:val="18"/>
-        </w:rPr>
-        <w:t>Vite</w:t>
-      </w:r>
-      <w:proofErr w:type="spellEnd"/>
-      <w:r>
-        <w:rPr>
-          <w:rFonts w:ascii="Arial" w:hAnsi="Arial" w:cs="Arial"/>
-          <w:bCs/>
-          <w:sz w:val="18"/>
-          <w:szCs w:val="18"/>
-        </w:rPr>
-        <w:t xml:space="preserve"> and initialize a backend project in the chosen server-side framework</w:t>
-      </w:r>
-    </w:p>
-    <w:p>
-      <w:pPr>
-        <w:pStyle w:val="ListParagraph"/>
-        <w:numPr>
-          <w:ilvl w:val="0"/>
-          <w:numId w:val="3"/>
-        </w:numPr>
-        <w:rPr>
-          <w:rFonts w:ascii="Arial" w:hAnsi="Arial" w:cs="Arial"/>
-          <w:bCs/>
-          <w:sz w:val="18"/>
-          <w:szCs w:val="18"/>
-        </w:rPr>
-      </w:pPr>
-      <w:r>
-        <w:rPr>
-          <w:rFonts w:ascii="Arial" w:hAnsi="Arial" w:cs="Arial"/>
-          <w:bCs/>
-          <w:sz w:val="18"/>
-          <w:szCs w:val="18"/>
-        </w:rPr>
-        <w:t>Understand the full-stack folder structure, client-server interaction, and API-first workflow</w:t>
-      </w:r>
-    </w:p>
-    <w:p>
-      <w:pPr>
         <w:rPr>
           <w:rFonts w:ascii="Arial" w:hAnsi="Arial" w:cs="Arial"/>
           <w:b/>
@@ -3293,79 +3161,7 @@
           <w:sz w:val="18"/>
           <w:szCs w:val="18"/>
         </w:rPr>
-        <w:t>Lab 2 — Server-Side Framework Fundamentals</w:t>
-      </w:r>
-    </w:p>
-    <w:p>
-      <w:pPr>
-        <w:pStyle w:val="ListParagraph"/>
-        <w:numPr>
-          <w:ilvl w:val="0"/>
-          <w:numId w:val="4"/>
-        </w:numPr>
-        <w:rPr>
-          <w:rFonts w:ascii="Arial" w:hAnsi="Arial" w:cs="Arial"/>
-          <w:bCs/>
-          <w:sz w:val="18"/>
-          <w:szCs w:val="18"/>
-        </w:rPr>
-      </w:pPr>
-      <w:r>
-        <w:rPr>
-          <w:rFonts w:ascii="Arial" w:hAnsi="Arial" w:cs="Arial"/>
-          <w:bCs/>
-          <w:sz w:val="18"/>
-          <w:szCs w:val="18"/>
-        </w:rPr>
-        <w:t>Project structure, routing, controllers, middleware, and configuration in the selected backend framework</w:t>
-      </w:r>
-    </w:p>
-    <w:p>
-      <w:pPr>
-        <w:pStyle w:val="ListParagraph"/>
-        <w:numPr>
-          <w:ilvl w:val="0"/>
-          <w:numId w:val="4"/>
-        </w:numPr>
-        <w:rPr>
-          <w:rFonts w:ascii="Arial" w:hAnsi="Arial" w:cs="Arial"/>
-          <w:bCs/>
-          <w:sz w:val="18"/>
-          <w:szCs w:val="18"/>
-        </w:rPr>
-      </w:pPr>
-      <w:r>
-        <w:rPr>
-          <w:rFonts w:ascii="Arial" w:hAnsi="Arial" w:cs="Arial"/>
-          <w:bCs/>
-          <w:sz w:val="18"/>
-          <w:szCs w:val="18"/>
-        </w:rPr>
-        <w:t>Database migrations, models, seeders, and ORM / query builder basics</w:t>
-      </w:r>
-    </w:p>
-    <w:p>
-      <w:pPr>
-        <w:pStyle w:val="ListParagraph"/>
-        <w:numPr>
-          <w:ilvl w:val="0"/>
-          <w:numId w:val="4"/>
-        </w:numPr>
-        <w:rPr>
-          <w:rFonts w:ascii="Arial" w:hAnsi="Arial" w:cs="Arial"/>
-          <w:bCs/>
-          <w:sz w:val="18"/>
-          <w:szCs w:val="18"/>
-        </w:rPr>
-      </w:pPr>
-      <w:r>
-        <w:rPr>
-          <w:rFonts w:ascii="Arial" w:hAnsi="Arial" w:cs="Arial"/>
-          <w:bCs/>
-          <w:sz w:val="18"/>
-          <w:szCs w:val="18"/>
-        </w:rPr>
-        <w:t>Build a simple resource module with database-backed CRUD</w:t>
+        <w:t>Lab 2 — Server-Side Framework Fundamentals and Database Migrations</w:t>
       </w:r>
     </w:p>
     <w:p>
@@ -3386,100 +3182,7 @@
           <w:sz w:val="18"/>
           <w:szCs w:val="18"/>
         </w:rPr>
-        <w:t>Lab 3 — REST API Development</w:t>
-      </w:r>
-    </w:p>
-    <w:p>
-      <w:pPr>
-        <w:pStyle w:val="ListParagraph"/>
-        <w:numPr>
-          <w:ilvl w:val="0"/>
-          <w:numId w:val="12"/>
-        </w:numPr>
-        <w:rPr>
-          <w:rFonts w:ascii="Arial" w:hAnsi="Arial" w:cs="Arial"/>
-          <w:bCs/>
-          <w:sz w:val="18"/>
-          <w:szCs w:val="18"/>
-        </w:rPr>
-      </w:pPr>
-      <w:r>
-        <w:rPr>
-          <w:rFonts w:ascii="Arial" w:hAnsi="Arial" w:cs="Arial"/>
-          <w:bCs/>
-          <w:sz w:val="18"/>
-          <w:szCs w:val="18"/>
-        </w:rPr>
-        <w:t xml:space="preserve">Build </w:t>
-      </w:r>
-      <w:proofErr w:type="spellStart"/>
-      <w:r>
-        <w:rPr>
-          <w:rFonts w:ascii="Arial" w:hAnsi="Arial" w:cs="Arial"/>
-          <w:bCs/>
-          <w:sz w:val="18"/>
-          <w:szCs w:val="18"/>
-        </w:rPr>
-        <w:t>RESTful</w:t>
-      </w:r>
-      <w:proofErr w:type="spellEnd"/>
-      <w:r>
-        <w:rPr>
-          <w:rFonts w:ascii="Arial" w:hAnsi="Arial" w:cs="Arial"/>
-          <w:bCs/>
-          <w:sz w:val="18"/>
-          <w:szCs w:val="18"/>
-        </w:rPr>
-        <w:t xml:space="preserve"> API endpoints with controllers and resource routes</w:t>
-      </w:r>
-    </w:p>
-    <w:p>
-      <w:pPr>
-        <w:pStyle w:val="ListParagraph"/>
-        <w:numPr>
-          <w:ilvl w:val="0"/>
-          <w:numId w:val="12"/>
-        </w:numPr>
-        <w:rPr>
-          <w:rFonts w:ascii="Arial" w:hAnsi="Arial" w:cs="Arial"/>
-          <w:bCs/>
-          <w:sz w:val="18"/>
-          <w:szCs w:val="18"/>
-        </w:rPr>
-      </w:pPr>
-      <w:r>
-        <w:rPr>
-          <w:rFonts w:ascii="Arial" w:hAnsi="Arial" w:cs="Arial"/>
-          <w:bCs/>
-          <w:sz w:val="18"/>
-          <w:szCs w:val="18"/>
-        </w:rPr>
-        <w:lastRenderedPageBreak/>
-        <w:t>Request validation, JSON responses, error handling, and API testing with Postman</w:t>
-      </w:r>
-    </w:p>
-    <w:p>
-      <w:pPr>
-        <w:pStyle w:val="ListParagraph"/>
-        <w:numPr>
-          <w:ilvl w:val="0"/>
-          <w:numId w:val="12"/>
-        </w:numPr>
-        <w:rPr>
-          <w:rFonts w:ascii="Arial" w:hAnsi="Arial" w:cs="Arial"/>
-          <w:bCs/>
-          <w:sz w:val="18"/>
-          <w:szCs w:val="18"/>
-        </w:rPr>
-      </w:pPr>
-      <w:r>
-        <w:rPr>
-          <w:rFonts w:ascii="Arial" w:hAnsi="Arial" w:cs="Arial"/>
-          <w:bCs/>
-          <w:sz w:val="18"/>
-          <w:szCs w:val="18"/>
-        </w:rPr>
-        <w:t>Model relationships and relational CRUD operations</w:t>
+        <w:t>Lab 3 — REST API Development and Testing with Postman</w:t>
       </w:r>
     </w:p>
     <w:p>
@@ -3500,79 +3203,7 @@
           <w:sz w:val="18"/>
           <w:szCs w:val="18"/>
         </w:rPr>
-        <w:t>Lab 4 — Alternative Backend Framework / Comparative Implementation</w:t>
-      </w:r>
-    </w:p>
-    <w:p>
-      <w:pPr>
-        <w:pStyle w:val="ListParagraph"/>
-        <w:numPr>
-          <w:ilvl w:val="0"/>
-          <w:numId w:val="11"/>
-        </w:numPr>
-        <w:rPr>
-          <w:rFonts w:ascii="Arial" w:hAnsi="Arial" w:cs="Arial"/>
-          <w:bCs/>
-          <w:sz w:val="18"/>
-          <w:szCs w:val="18"/>
-        </w:rPr>
-      </w:pPr>
-      <w:r>
-        <w:rPr>
-          <w:rFonts w:ascii="Arial" w:hAnsi="Arial" w:cs="Arial"/>
-          <w:bCs/>
-          <w:sz w:val="18"/>
-          <w:szCs w:val="18"/>
-        </w:rPr>
-        <w:t>Implement the same or a similar backend module in an alternative server-side framework if taught during the semester</w:t>
-      </w:r>
-    </w:p>
-    <w:p>
-      <w:pPr>
-        <w:pStyle w:val="ListParagraph"/>
-        <w:numPr>
-          <w:ilvl w:val="0"/>
-          <w:numId w:val="11"/>
-        </w:numPr>
-        <w:rPr>
-          <w:rFonts w:ascii="Arial" w:hAnsi="Arial" w:cs="Arial"/>
-          <w:bCs/>
-          <w:sz w:val="18"/>
-          <w:szCs w:val="18"/>
-        </w:rPr>
-      </w:pPr>
-      <w:r>
-        <w:rPr>
-          <w:rFonts w:ascii="Arial" w:hAnsi="Arial" w:cs="Arial"/>
-          <w:bCs/>
-          <w:sz w:val="18"/>
-          <w:szCs w:val="18"/>
-        </w:rPr>
-        <w:t>Compare routing, middleware, validation, ORM / query builder usage, and project structure</w:t>
-      </w:r>
-    </w:p>
-    <w:p>
-      <w:pPr>
-        <w:pStyle w:val="ListParagraph"/>
-        <w:numPr>
-          <w:ilvl w:val="0"/>
-          <w:numId w:val="11"/>
-        </w:numPr>
-        <w:rPr>
-          <w:rFonts w:ascii="Arial" w:hAnsi="Arial" w:cs="Arial"/>
-          <w:bCs/>
-          <w:sz w:val="18"/>
-          <w:szCs w:val="18"/>
-        </w:rPr>
-      </w:pPr>
-      <w:r>
-        <w:rPr>
-          <w:rFonts w:ascii="Arial" w:hAnsi="Arial" w:cs="Arial"/>
-          <w:bCs/>
-          <w:sz w:val="18"/>
-          <w:szCs w:val="18"/>
-        </w:rPr>
-        <w:t>Explore similarities and differences between backend framework workflows</w:t>
+        <w:t>Lab 4 — Comparative Implementation in an Alternative Backend Framework (Optional)</w:t>
       </w:r>
     </w:p>
     <w:p>
@@ -3593,79 +3224,7 @@
           <w:sz w:val="18"/>
           <w:szCs w:val="18"/>
         </w:rPr>
-        <w:t>Lab 5 — Authentication and Authorization</w:t>
-      </w:r>
-    </w:p>
-    <w:p>
-      <w:pPr>
-        <w:pStyle w:val="ListParagraph"/>
-        <w:numPr>
-          <w:ilvl w:val="0"/>
-          <w:numId w:val="10"/>
-        </w:numPr>
-        <w:rPr>
-          <w:rFonts w:ascii="Arial" w:hAnsi="Arial" w:cs="Arial"/>
-          <w:bCs/>
-          <w:sz w:val="18"/>
-          <w:szCs w:val="18"/>
-        </w:rPr>
-      </w:pPr>
-      <w:r>
-        <w:rPr>
-          <w:rFonts w:ascii="Arial" w:hAnsi="Arial" w:cs="Arial"/>
-          <w:bCs/>
-          <w:sz w:val="18"/>
-          <w:szCs w:val="18"/>
-        </w:rPr>
-        <w:t>User registration, login, logout, password hashing, protected routes</w:t>
-      </w:r>
-    </w:p>
-    <w:p>
-      <w:pPr>
-        <w:pStyle w:val="ListParagraph"/>
-        <w:numPr>
-          <w:ilvl w:val="0"/>
-          <w:numId w:val="10"/>
-        </w:numPr>
-        <w:rPr>
-          <w:rFonts w:ascii="Arial" w:hAnsi="Arial" w:cs="Arial"/>
-          <w:bCs/>
-          <w:sz w:val="18"/>
-          <w:szCs w:val="18"/>
-        </w:rPr>
-      </w:pPr>
-      <w:r>
-        <w:rPr>
-          <w:rFonts w:ascii="Arial" w:hAnsi="Arial" w:cs="Arial"/>
-          <w:bCs/>
-          <w:sz w:val="18"/>
-          <w:szCs w:val="18"/>
-        </w:rPr>
-        <w:t>Token/session-based authentication concepts in the chosen backend framework</w:t>
-      </w:r>
-    </w:p>
-    <w:p>
-      <w:pPr>
-        <w:pStyle w:val="ListParagraph"/>
-        <w:numPr>
-          <w:ilvl w:val="0"/>
-          <w:numId w:val="10"/>
-        </w:numPr>
-        <w:rPr>
-          <w:rFonts w:ascii="Arial" w:hAnsi="Arial" w:cs="Arial"/>
-          <w:bCs/>
-          <w:sz w:val="18"/>
-          <w:szCs w:val="18"/>
-        </w:rPr>
-      </w:pPr>
-      <w:r>
-        <w:rPr>
-          <w:rFonts w:ascii="Arial" w:hAnsi="Arial" w:cs="Arial"/>
-          <w:bCs/>
-          <w:sz w:val="18"/>
-          <w:szCs w:val="18"/>
-        </w:rPr>
-        <w:t>Role-based access and route protection for admin/user features</w:t>
+        <w:t>Lab 5 — Authentication and Role-Based Authorization</w:t>
       </w:r>
     </w:p>
     <w:p>
@@ -3686,90 +3245,7 @@
           <w:sz w:val="18"/>
           <w:szCs w:val="18"/>
         </w:rPr>
-        <w:t>Lab 6 — React Frontend Integration</w:t>
-      </w:r>
-    </w:p>
-    <w:p>
-      <w:pPr>
-        <w:pStyle w:val="ListParagraph"/>
-        <w:numPr>
-          <w:ilvl w:val="0"/>
-          <w:numId w:val="9"/>
-        </w:numPr>
-        <w:rPr>
-          <w:rFonts w:ascii="Arial" w:hAnsi="Arial" w:cs="Arial"/>
-          <w:bCs/>
-          <w:sz w:val="18"/>
-          <w:szCs w:val="18"/>
-        </w:rPr>
-      </w:pPr>
-      <w:r>
-        <w:rPr>
-          <w:rFonts w:ascii="Arial" w:hAnsi="Arial" w:cs="Arial"/>
-          <w:bCs/>
-          <w:sz w:val="18"/>
-          <w:szCs w:val="18"/>
-        </w:rPr>
-        <w:t xml:space="preserve">Connect React components to backend APIs using Fetch or </w:t>
-      </w:r>
-      <w:proofErr w:type="spellStart"/>
-      <w:r>
-        <w:rPr>
-          <w:rFonts w:ascii="Arial" w:hAnsi="Arial" w:cs="Arial"/>
-          <w:bCs/>
-          <w:sz w:val="18"/>
-          <w:szCs w:val="18"/>
-        </w:rPr>
-        <w:t>Axios</w:t>
-      </w:r>
-      <w:proofErr w:type="spellEnd"/>
-    </w:p>
-    <w:p>
-      <w:pPr>
-        <w:pStyle w:val="ListParagraph"/>
-        <w:numPr>
-          <w:ilvl w:val="0"/>
-          <w:numId w:val="9"/>
-        </w:numPr>
-        <w:rPr>
-          <w:rFonts w:ascii="Arial" w:hAnsi="Arial" w:cs="Arial"/>
-          <w:bCs/>
-          <w:sz w:val="18"/>
-          <w:szCs w:val="18"/>
-        </w:rPr>
-      </w:pPr>
-      <w:r>
-        <w:rPr>
-          <w:rFonts w:ascii="Arial" w:hAnsi="Arial" w:cs="Arial"/>
-          <w:bCs/>
-          <w:sz w:val="18"/>
-          <w:szCs w:val="18"/>
-        </w:rPr>
-        <w:t>Form submission, loading states, validation messages, and error handling</w:t>
-      </w:r>
-    </w:p>
-    <w:p>
-      <w:pPr>
-        <w:pStyle w:val="ListParagraph"/>
-        <w:numPr>
-          <w:ilvl w:val="0"/>
-          <w:numId w:val="9"/>
-        </w:numPr>
-        <w:rPr>
-          <w:rFonts w:ascii="Arial" w:hAnsi="Arial" w:cs="Arial"/>
-          <w:bCs/>
-          <w:sz w:val="18"/>
-          <w:szCs w:val="18"/>
-        </w:rPr>
-      </w:pPr>
-      <w:r>
-        <w:rPr>
-          <w:rFonts w:ascii="Arial" w:hAnsi="Arial" w:cs="Arial"/>
-          <w:bCs/>
-          <w:sz w:val="18"/>
-          <w:szCs w:val="18"/>
-        </w:rPr>
-        <w:t>React Router integration with public and protected pages</w:t>
+        <w:t>Lab 6 — React Frontend Integration with Backend APIs</w:t>
       </w:r>
     </w:p>
     <w:p>
@@ -3795,78 +3271,6 @@
     </w:p>
     <w:p>
       <w:pPr>
-        <w:pStyle w:val="ListParagraph"/>
-        <w:numPr>
-          <w:ilvl w:val="0"/>
-          <w:numId w:val="8"/>
-        </w:numPr>
-        <w:rPr>
-          <w:rFonts w:ascii="Arial" w:hAnsi="Arial" w:cs="Arial"/>
-          <w:bCs/>
-          <w:sz w:val="18"/>
-          <w:szCs w:val="18"/>
-        </w:rPr>
-      </w:pPr>
-      <w:r>
-        <w:rPr>
-          <w:rFonts w:ascii="Arial" w:hAnsi="Arial" w:cs="Arial"/>
-          <w:bCs/>
-          <w:sz w:val="18"/>
-          <w:szCs w:val="18"/>
-        </w:rPr>
-        <w:t>Build a complete CRUD module with React frontend and backend API</w:t>
-      </w:r>
-    </w:p>
-    <w:p>
-      <w:pPr>
-        <w:pStyle w:val="ListParagraph"/>
-        <w:numPr>
-          <w:ilvl w:val="0"/>
-          <w:numId w:val="8"/>
-        </w:numPr>
-        <w:rPr>
-          <w:rFonts w:ascii="Arial" w:hAnsi="Arial" w:cs="Arial"/>
-          <w:bCs/>
-          <w:sz w:val="18"/>
-          <w:szCs w:val="18"/>
-        </w:rPr>
-      </w:pPr>
-      <w:r>
-        <w:rPr>
-          <w:rFonts w:ascii="Arial" w:hAnsi="Arial" w:cs="Arial"/>
-          <w:bCs/>
-          <w:sz w:val="18"/>
-          <w:szCs w:val="18"/>
-        </w:rPr>
-        <w:t>Search, filter, pagination, and relational data display</w:t>
-      </w:r>
-    </w:p>
-    <w:p>
-      <w:pPr>
-        <w:pStyle w:val="ListParagraph"/>
-        <w:numPr>
-          <w:ilvl w:val="0"/>
-          <w:numId w:val="8"/>
-        </w:numPr>
-        <w:rPr>
-          <w:rFonts w:ascii="Arial" w:hAnsi="Arial" w:cs="Arial"/>
-          <w:bCs/>
-          <w:sz w:val="18"/>
-          <w:szCs w:val="18"/>
-        </w:rPr>
-      </w:pPr>
-      <w:r>
-        <w:rPr>
-          <w:rFonts w:ascii="Arial" w:hAnsi="Arial" w:cs="Arial"/>
-          <w:bCs/>
-          <w:sz w:val="18"/>
-          <w:szCs w:val="18"/>
-        </w:rPr>
-        <w:t>Keep frontend state synchronized with server updates</w:t>
-      </w:r>
-    </w:p>
-    <w:p>
-      <w:pPr>
         <w:rPr>
           <w:rFonts w:ascii="Arial" w:hAnsi="Arial" w:cs="Arial"/>
           <w:b/>
@@ -3888,98 +3292,6 @@
     </w:p>
     <w:p>
       <w:pPr>
-        <w:pStyle w:val="ListParagraph"/>
-        <w:numPr>
-          <w:ilvl w:val="0"/>
-          <w:numId w:val="7"/>
-        </w:numPr>
-        <w:rPr>
-          <w:rFonts w:ascii="Arial" w:hAnsi="Arial" w:cs="Arial"/>
-          <w:bCs/>
-          <w:sz w:val="18"/>
-          <w:szCs w:val="18"/>
-        </w:rPr>
-      </w:pPr>
-      <w:r>
-        <w:rPr>
-          <w:rFonts w:ascii="Arial" w:hAnsi="Arial" w:cs="Arial"/>
-          <w:bCs/>
-          <w:sz w:val="18"/>
-          <w:szCs w:val="18"/>
-        </w:rPr>
-        <w:t>File/image upload workflow and storage handling</w:t>
-      </w:r>
-    </w:p>
-    <w:p>
-      <w:pPr>
-        <w:pStyle w:val="ListParagraph"/>
-        <w:numPr>
-          <w:ilvl w:val="0"/>
-          <w:numId w:val="7"/>
-        </w:numPr>
-        <w:rPr>
-          <w:rFonts w:ascii="Arial" w:hAnsi="Arial" w:cs="Arial"/>
-          <w:bCs/>
-          <w:sz w:val="18"/>
-          <w:szCs w:val="18"/>
-        </w:rPr>
-      </w:pPr>
-      <w:r>
-        <w:rPr>
-          <w:rFonts w:ascii="Arial" w:hAnsi="Arial" w:cs="Arial"/>
-          <w:bCs/>
-          <w:sz w:val="18"/>
-          <w:szCs w:val="18"/>
-        </w:rPr>
-        <w:t xml:space="preserve">Input validation and </w:t>
-      </w:r>
-      <w:proofErr w:type="spellStart"/>
-      <w:r>
-        <w:rPr>
-          <w:rFonts w:ascii="Arial" w:hAnsi="Arial" w:cs="Arial"/>
-          <w:bCs/>
-          <w:sz w:val="18"/>
-          <w:szCs w:val="18"/>
-        </w:rPr>
-        <w:t>sanitisation</w:t>
-      </w:r>
-      <w:proofErr w:type="spellEnd"/>
-      <w:r>
-        <w:rPr>
-          <w:rFonts w:ascii="Arial" w:hAnsi="Arial" w:cs="Arial"/>
-          <w:bCs/>
-          <w:sz w:val="18"/>
-          <w:szCs w:val="18"/>
-        </w:rPr>
-        <w:t xml:space="preserve"> at frontend and backend levels</w:t>
-      </w:r>
-    </w:p>
-    <w:p>
-      <w:pPr>
-        <w:pStyle w:val="ListParagraph"/>
-        <w:numPr>
-          <w:ilvl w:val="0"/>
-          <w:numId w:val="7"/>
-        </w:numPr>
-        <w:rPr>
-          <w:rFonts w:ascii="Arial" w:hAnsi="Arial" w:cs="Arial"/>
-          <w:bCs/>
-          <w:sz w:val="18"/>
-          <w:szCs w:val="18"/>
-        </w:rPr>
-      </w:pPr>
-      <w:r>
-        <w:rPr>
-          <w:rFonts w:ascii="Arial" w:hAnsi="Arial" w:cs="Arial"/>
-          <w:bCs/>
-          <w:sz w:val="18"/>
-          <w:szCs w:val="18"/>
-        </w:rPr>
-        <w:t>Basic lab-level security practices: authentication checks, protected resources, and secure error handling</w:t>
-      </w:r>
-    </w:p>
-    <w:p>
-      <w:pPr>
         <w:rPr>
           <w:rFonts w:ascii="Arial" w:hAnsi="Arial" w:cs="Arial"/>
           <w:b/>
@@ -4001,122 +3313,6 @@
     </w:p>
     <w:p>
       <w:pPr>
-        <w:pStyle w:val="ListParagraph"/>
-        <w:numPr>
-          <w:ilvl w:val="0"/>
-          <w:numId w:val="6"/>
-        </w:numPr>
-        <w:rPr>
-          <w:rFonts w:ascii="Arial" w:hAnsi="Arial" w:cs="Arial"/>
-          <w:bCs/>
-          <w:sz w:val="18"/>
-          <w:szCs w:val="18"/>
-        </w:rPr>
-      </w:pPr>
-      <w:r>
-        <w:rPr>
-          <w:rFonts w:ascii="Arial" w:hAnsi="Arial" w:cs="Arial"/>
-          <w:bCs/>
-          <w:sz w:val="18"/>
-          <w:szCs w:val="18"/>
-        </w:rPr>
-        <w:t>Create Postman collections for endpoint testing</w:t>
-      </w:r>
-    </w:p>
-    <w:p>
-      <w:pPr>
-        <w:pStyle w:val="ListParagraph"/>
-        <w:numPr>
-          <w:ilvl w:val="0"/>
-          <w:numId w:val="6"/>
-        </w:numPr>
-        <w:rPr>
-          <w:rFonts w:ascii="Arial" w:hAnsi="Arial" w:cs="Arial"/>
-          <w:bCs/>
-          <w:sz w:val="18"/>
-          <w:szCs w:val="18"/>
-        </w:rPr>
-      </w:pPr>
-      <w:r>
-        <w:rPr>
-          <w:rFonts w:ascii="Arial" w:hAnsi="Arial" w:cs="Arial"/>
-          <w:bCs/>
-          <w:sz w:val="18"/>
-          <w:szCs w:val="18"/>
-        </w:rPr>
-        <w:t>Basic automated API tests / request validation checks</w:t>
-      </w:r>
-    </w:p>
-    <w:p>
-      <w:pPr>
-        <w:pStyle w:val="ListParagraph"/>
-        <w:numPr>
-          <w:ilvl w:val="0"/>
-          <w:numId w:val="6"/>
-        </w:numPr>
-        <w:rPr>
-          <w:rFonts w:ascii="Arial" w:hAnsi="Arial" w:cs="Arial"/>
-          <w:bCs/>
-          <w:sz w:val="18"/>
-          <w:szCs w:val="18"/>
-        </w:rPr>
-      </w:pPr>
-      <w:r>
-        <w:rPr>
-          <w:rFonts w:ascii="Arial" w:hAnsi="Arial" w:cs="Arial"/>
-          <w:bCs/>
-          <w:sz w:val="18"/>
-          <w:szCs w:val="18"/>
-        </w:rPr>
-        <w:t xml:space="preserve">Debugging with browser </w:t>
-      </w:r>
-      <w:proofErr w:type="spellStart"/>
-      <w:r>
-        <w:rPr>
-          <w:rFonts w:ascii="Arial" w:hAnsi="Arial" w:cs="Arial"/>
-          <w:bCs/>
-          <w:sz w:val="18"/>
-          <w:szCs w:val="18"/>
-        </w:rPr>
-        <w:t>DevTools</w:t>
-      </w:r>
-      <w:proofErr w:type="spellEnd"/>
-      <w:r>
-        <w:rPr>
-          <w:rFonts w:ascii="Arial" w:hAnsi="Arial" w:cs="Arial"/>
-          <w:bCs/>
-          <w:sz w:val="18"/>
-          <w:szCs w:val="18"/>
-        </w:rPr>
-        <w:t>, backend logs, and framework debugging tools</w:t>
-      </w:r>
-    </w:p>
-    <w:p>
-      <w:pPr>
-        <w:pStyle w:val="ListParagraph"/>
-        <w:numPr>
-          <w:ilvl w:val="0"/>
-          <w:numId w:val="6"/>
-        </w:numPr>
-        <w:rPr>
-          <w:rFonts w:ascii="Arial" w:hAnsi="Arial" w:cs="Arial"/>
-          <w:bCs/>
-          <w:sz w:val="18"/>
-          <w:szCs w:val="18"/>
-        </w:rPr>
-      </w:pPr>
-      <w:r>
-        <w:rPr>
-          <w:rFonts w:ascii="Arial" w:hAnsi="Arial" w:cs="Arial"/>
-          <w:bCs/>
-          <w:sz w:val="18"/>
-          <w:szCs w:val="18"/>
-        </w:rPr>
-        <w:t>Prepare API usage documentation for the final project</w:t>
-      </w:r>
-    </w:p>
-    <w:p>
-      <w:pPr>
         <w:rPr>
           <w:rFonts w:ascii="Arial" w:hAnsi="Arial" w:cs="Arial"/>
           <w:b/>
@@ -4144,7 +3340,7 @@
           <w:sz w:val="18"/>
           <w:szCs w:val="18"/>
         </w:rPr>
-        <w:t>Docker</w:t>
+        <w:t>Dockerization</w:t>
       </w:r>
       <w:proofErr w:type="spellEnd"/>
       <w:r>
@@ -4160,228 +3356,6 @@
     </w:p>
     <w:p>
       <w:pPr>
-        <w:pStyle w:val="ListParagraph"/>
-        <w:numPr>
-          <w:ilvl w:val="0"/>
-          <w:numId w:val="5"/>
-        </w:numPr>
-        <w:rPr>
-          <w:rFonts w:ascii="Arial" w:hAnsi="Arial" w:cs="Arial"/>
-          <w:bCs/>
-          <w:sz w:val="18"/>
-          <w:szCs w:val="18"/>
-        </w:rPr>
-      </w:pPr>
-      <w:proofErr w:type="spellStart"/>
-      <w:r>
-        <w:rPr>
-          <w:rFonts w:ascii="Arial" w:hAnsi="Arial" w:cs="Arial"/>
-          <w:bCs/>
-          <w:sz w:val="18"/>
-          <w:szCs w:val="18"/>
-        </w:rPr>
-        <w:t>Dockerise</w:t>
-      </w:r>
-      <w:proofErr w:type="spellEnd"/>
-      <w:r>
-        <w:rPr>
-          <w:rFonts w:ascii="Arial" w:hAnsi="Arial" w:cs="Arial"/>
-          <w:bCs/>
-          <w:sz w:val="18"/>
-          <w:szCs w:val="18"/>
-        </w:rPr>
-        <w:t xml:space="preserve"> the application stack using containers for frontend, backend, and database</w:t>
-      </w:r>
-    </w:p>
-    <w:p>
-      <w:pPr>
-        <w:pStyle w:val="ListParagraph"/>
-        <w:numPr>
-          <w:ilvl w:val="0"/>
-          <w:numId w:val="5"/>
-        </w:numPr>
-        <w:rPr>
-          <w:rFonts w:ascii="Arial" w:hAnsi="Arial" w:cs="Arial"/>
-          <w:bCs/>
-          <w:sz w:val="18"/>
-          <w:szCs w:val="18"/>
-        </w:rPr>
-      </w:pPr>
-      <w:r>
-        <w:rPr>
-          <w:rFonts w:ascii="Arial" w:hAnsi="Arial" w:cs="Arial"/>
-          <w:bCs/>
-          <w:sz w:val="18"/>
-          <w:szCs w:val="18"/>
-        </w:rPr>
-        <w:t xml:space="preserve">Use </w:t>
-      </w:r>
-      <w:proofErr w:type="spellStart"/>
-      <w:r>
-        <w:rPr>
-          <w:rFonts w:ascii="Arial" w:hAnsi="Arial" w:cs="Arial"/>
-          <w:bCs/>
-          <w:sz w:val="18"/>
-          <w:szCs w:val="18"/>
-        </w:rPr>
-        <w:t>Docker</w:t>
-      </w:r>
-      <w:proofErr w:type="spellEnd"/>
-      <w:r>
-        <w:rPr>
-          <w:rFonts w:ascii="Arial" w:hAnsi="Arial" w:cs="Arial"/>
-          <w:bCs/>
-          <w:sz w:val="18"/>
-          <w:szCs w:val="18"/>
-        </w:rPr>
-        <w:t xml:space="preserve"> Compose for local development and service orchestration</w:t>
-      </w:r>
-    </w:p>
-    <w:p>
-      <w:pPr>
-        <w:pStyle w:val="ListParagraph"/>
-        <w:numPr>
-          <w:ilvl w:val="0"/>
-          <w:numId w:val="5"/>
-        </w:numPr>
-        <w:rPr>
-          <w:rFonts w:ascii="Arial" w:hAnsi="Arial" w:cs="Arial"/>
-          <w:bCs/>
-          <w:sz w:val="18"/>
-          <w:szCs w:val="18"/>
-        </w:rPr>
-      </w:pPr>
-      <w:r>
-        <w:rPr>
-          <w:rFonts w:ascii="Arial" w:hAnsi="Arial" w:cs="Arial"/>
-          <w:bCs/>
-          <w:sz w:val="18"/>
-          <w:szCs w:val="18"/>
-        </w:rPr>
-        <w:t>Final project: develop and demonstrate a secure full-stack web application using React frontend and the selected backend framework</w:t>
-      </w:r>
-    </w:p>
-    <w:p>
-      <w:pPr>
-        <w:rPr>
-          <w:rFonts w:ascii="Arial" w:hAnsi="Arial" w:cs="Arial"/>
-          <w:bCs/>
-          <w:sz w:val="18"/>
-          <w:szCs w:val="18"/>
-        </w:rPr>
-      </w:pPr>
-      <w:r>
-        <w:rPr>
-          <w:rFonts w:ascii="Arial" w:hAnsi="Arial" w:cs="Arial"/>
-          <w:b/>
-          <w:bCs/>
-          <w:sz w:val="18"/>
-          <w:szCs w:val="18"/>
-        </w:rPr>
-        <w:t>Capstone requirements:</w:t>
-      </w:r>
-      <w:r>
-        <w:rPr>
-          <w:rFonts w:ascii="Arial" w:hAnsi="Arial" w:cs="Arial"/>
-          <w:bCs/>
-          <w:sz w:val="18"/>
-          <w:szCs w:val="18"/>
-        </w:rPr>
-        <w:br/>
-      </w:r>
-    </w:p>
-    <w:p>
-      <w:pPr>
-        <w:ind w:left="720"/>
-        <w:rPr>
-          <w:rFonts w:ascii="Arial" w:hAnsi="Arial" w:cs="Arial"/>
-          <w:bCs/>
-          <w:sz w:val="18"/>
-          <w:szCs w:val="18"/>
-        </w:rPr>
-      </w:pPr>
-      <w:r>
-        <w:rPr>
-          <w:rFonts w:ascii="Arial" w:hAnsi="Arial" w:cs="Arial"/>
-          <w:bCs/>
-          <w:sz w:val="18"/>
-          <w:szCs w:val="18"/>
-        </w:rPr>
-        <w:t>- User authentication</w:t>
-      </w:r>
-      <w:r>
-        <w:rPr>
-          <w:rFonts w:ascii="Arial" w:hAnsi="Arial" w:cs="Arial"/>
-          <w:bCs/>
-          <w:sz w:val="18"/>
-          <w:szCs w:val="18"/>
-        </w:rPr>
-        <w:br/>
-        <w:t>- Database-backed CRUD operations</w:t>
-      </w:r>
-      <w:r>
-        <w:rPr>
-          <w:rFonts w:ascii="Arial" w:hAnsi="Arial" w:cs="Arial"/>
-          <w:bCs/>
-          <w:sz w:val="18"/>
-          <w:szCs w:val="18"/>
-        </w:rPr>
-        <w:br/>
-        <w:t>- React frontend integrated with backend API</w:t>
-      </w:r>
-      <w:r>
-        <w:rPr>
-          <w:rFonts w:ascii="Arial" w:hAnsi="Arial" w:cs="Arial"/>
-          <w:bCs/>
-          <w:sz w:val="18"/>
-          <w:szCs w:val="18"/>
-        </w:rPr>
-        <w:br/>
-        <w:t>- Validation and error handling</w:t>
-      </w:r>
-      <w:r>
-        <w:rPr>
-          <w:rFonts w:ascii="Arial" w:hAnsi="Arial" w:cs="Arial"/>
-          <w:bCs/>
-          <w:sz w:val="18"/>
-          <w:szCs w:val="18"/>
-        </w:rPr>
-        <w:br/>
-        <w:t>- Postman collection / API documentation</w:t>
-      </w:r>
-      <w:r>
-        <w:rPr>
-          <w:rFonts w:ascii="Arial" w:hAnsi="Arial" w:cs="Arial"/>
-          <w:bCs/>
-          <w:sz w:val="18"/>
-          <w:szCs w:val="18"/>
-        </w:rPr>
-        <w:br/>
-        <w:t xml:space="preserve">- </w:t>
-      </w:r>
-      <w:proofErr w:type="spellStart"/>
-      <w:r>
-        <w:rPr>
-          <w:rFonts w:ascii="Arial" w:hAnsi="Arial" w:cs="Arial"/>
-          <w:bCs/>
-          <w:sz w:val="18"/>
-          <w:szCs w:val="18"/>
-        </w:rPr>
-        <w:t>Docker</w:t>
-      </w:r>
-      <w:proofErr w:type="spellEnd"/>
-      <w:r>
-        <w:rPr>
-          <w:rFonts w:ascii="Arial" w:hAnsi="Arial" w:cs="Arial"/>
-          <w:bCs/>
-          <w:sz w:val="18"/>
-          <w:szCs w:val="18"/>
-        </w:rPr>
-        <w:t>-based local setup</w:t>
-      </w:r>
-    </w:p>
-    <w:p>
-      <w:pPr>
         <w:pStyle w:val="CustomHeading1"/>
         <w:rPr>
           <w:rFonts w:cs="Arial"/>
@@ -4515,793 +3489,6 @@
         <w:t>O'Reilly Media, 2019</w:t>
       </w:r>
     </w:p>
-    <w:p>
-      <w:pPr>
-        <w:pStyle w:val="CustomHeading1"/>
-        <w:rPr>
-          <w:rFonts w:cs="Arial"/>
-          <w:color w:val="000000" w:themeColor="text1"/>
-          <w:sz w:val="18"/>
-          <w:szCs w:val="18"/>
-        </w:rPr>
-      </w:pPr>
-      <w:r>
-        <w:rPr>
-          <w:rFonts w:cs="Arial"/>
-          <w:color w:val="000000" w:themeColor="text1"/>
-          <w:sz w:val="18"/>
-          <w:szCs w:val="18"/>
-        </w:rPr>
-        <w:t>Recommended Resources</w:t>
-      </w:r>
-    </w:p>
-    <w:p>
-      <w:pPr>
-        <w:pStyle w:val="ListNumber"/>
-        <w:spacing w:after="40"/>
-        <w:ind w:left="288"/>
-        <w:rPr>
-          <w:rFonts w:cs="Arial"/>
-          <w:color w:val="000000" w:themeColor="text1"/>
-          <w:sz w:val="18"/>
-          <w:szCs w:val="18"/>
-        </w:rPr>
-      </w:pPr>
-      <w:proofErr w:type="spellStart"/>
-      <w:r>
-        <w:rPr>
-          <w:rFonts w:cs="Arial"/>
-          <w:b/>
-          <w:color w:val="000000" w:themeColor="text1"/>
-          <w:sz w:val="18"/>
-          <w:szCs w:val="18"/>
-        </w:rPr>
-        <w:t>Laravel</w:t>
-      </w:r>
-      <w:proofErr w:type="spellEnd"/>
-      <w:r>
-        <w:rPr>
-          <w:rFonts w:cs="Arial"/>
-          <w:b/>
-          <w:color w:val="000000" w:themeColor="text1"/>
-          <w:sz w:val="18"/>
-          <w:szCs w:val="18"/>
-        </w:rPr>
-        <w:t xml:space="preserve"> Documentation</w:t>
-      </w:r>
-      <w:r>
-        <w:rPr>
-          <w:rFonts w:cs="Arial"/>
-          <w:color w:val="000000" w:themeColor="text1"/>
-          <w:sz w:val="18"/>
-          <w:szCs w:val="18"/>
-        </w:rPr>
-        <w:t xml:space="preserve"> — </w:t>
-      </w:r>
-      <w:r>
-        <w:rPr>
-          <w:rFonts w:cs="Arial"/>
-          <w:color w:val="000000" w:themeColor="text1"/>
-          <w:sz w:val="18"/>
-          <w:szCs w:val="18"/>
-          <w:u w:val="single"/>
-        </w:rPr>
-        <w:t>laravel.com/docs</w:t>
-      </w:r>
-      <w:r>
-        <w:rPr>
-          <w:rFonts w:cs="Arial"/>
-          <w:color w:val="000000" w:themeColor="text1"/>
-          <w:sz w:val="18"/>
-          <w:szCs w:val="18"/>
-        </w:rPr>
-        <w:t xml:space="preserve"> (https://laravel.com/docs)</w:t>
-      </w:r>
-    </w:p>
-    <w:p>
-      <w:pPr>
-        <w:pStyle w:val="ListNumber"/>
-        <w:spacing w:after="40"/>
-        <w:ind w:left="288"/>
-        <w:rPr>
-          <w:rFonts w:cs="Arial"/>
-          <w:color w:val="000000" w:themeColor="text1"/>
-          <w:sz w:val="18"/>
-          <w:szCs w:val="18"/>
-        </w:rPr>
-      </w:pPr>
-      <w:r>
-        <w:rPr>
-          <w:rFonts w:cs="Arial"/>
-          <w:b/>
-          <w:color w:val="000000" w:themeColor="text1"/>
-          <w:sz w:val="18"/>
-          <w:szCs w:val="18"/>
-        </w:rPr>
-        <w:t>Express.js Documentation</w:t>
-      </w:r>
-      <w:r>
-        <w:rPr>
-          <w:rFonts w:cs="Arial"/>
-          <w:color w:val="000000" w:themeColor="text1"/>
-          <w:sz w:val="18"/>
-          <w:szCs w:val="18"/>
-        </w:rPr>
-        <w:t xml:space="preserve"> — </w:t>
-      </w:r>
-      <w:r>
-        <w:rPr>
-          <w:rFonts w:cs="Arial"/>
-          <w:color w:val="000000" w:themeColor="text1"/>
-          <w:sz w:val="18"/>
-          <w:szCs w:val="18"/>
-          <w:u w:val="single"/>
-        </w:rPr>
-        <w:t>expressjs.com</w:t>
-      </w:r>
-      <w:r>
-        <w:rPr>
-          <w:rFonts w:cs="Arial"/>
-          <w:color w:val="000000" w:themeColor="text1"/>
-          <w:sz w:val="18"/>
-          <w:szCs w:val="18"/>
-        </w:rPr>
-        <w:t xml:space="preserve"> (https://expressjs.com)</w:t>
-      </w:r>
-    </w:p>
-    <w:p>
-      <w:pPr>
-        <w:pStyle w:val="ListNumber"/>
-        <w:spacing w:after="40"/>
-        <w:ind w:left="288"/>
-        <w:rPr>
-          <w:rFonts w:cs="Arial"/>
-          <w:color w:val="000000" w:themeColor="text1"/>
-          <w:sz w:val="18"/>
-          <w:szCs w:val="18"/>
-        </w:rPr>
-      </w:pPr>
-      <w:proofErr w:type="spellStart"/>
-      <w:r>
-        <w:rPr>
-          <w:rFonts w:cs="Arial"/>
-          <w:b/>
-          <w:color w:val="000000" w:themeColor="text1"/>
-          <w:sz w:val="18"/>
-          <w:szCs w:val="18"/>
-        </w:rPr>
-        <w:t>AdonisJS</w:t>
-      </w:r>
-      <w:proofErr w:type="spellEnd"/>
-      <w:r>
-        <w:rPr>
-          <w:rFonts w:cs="Arial"/>
-          <w:b/>
-          <w:color w:val="000000" w:themeColor="text1"/>
-          <w:sz w:val="18"/>
-          <w:szCs w:val="18"/>
-        </w:rPr>
-        <w:t xml:space="preserve"> Documentation</w:t>
-      </w:r>
-      <w:r>
-        <w:rPr>
-          <w:rFonts w:cs="Arial"/>
-          <w:color w:val="000000" w:themeColor="text1"/>
-          <w:sz w:val="18"/>
-          <w:szCs w:val="18"/>
-        </w:rPr>
-        <w:t xml:space="preserve"> — </w:t>
-      </w:r>
-      <w:r>
-        <w:rPr>
-          <w:rFonts w:cs="Arial"/>
-          <w:color w:val="000000" w:themeColor="text1"/>
-          <w:sz w:val="18"/>
-          <w:szCs w:val="18"/>
-          <w:u w:val="single"/>
-        </w:rPr>
-        <w:t>docs.adonisjs.com</w:t>
-      </w:r>
-      <w:r>
-        <w:rPr>
-          <w:rFonts w:cs="Arial"/>
-          <w:color w:val="000000" w:themeColor="text1"/>
-          <w:sz w:val="18"/>
-          <w:szCs w:val="18"/>
-        </w:rPr>
-        <w:t xml:space="preserve"> (https://docs.adonisjs.com)</w:t>
-      </w:r>
-    </w:p>
-    <w:p>
-      <w:pPr>
-        <w:pStyle w:val="ListNumber"/>
-        <w:spacing w:after="40"/>
-        <w:ind w:left="288"/>
-        <w:rPr>
-          <w:rFonts w:cs="Arial"/>
-          <w:color w:val="000000" w:themeColor="text1"/>
-          <w:sz w:val="18"/>
-          <w:szCs w:val="18"/>
-        </w:rPr>
-      </w:pPr>
-      <w:r>
-        <w:rPr>
-          <w:rFonts w:cs="Arial"/>
-          <w:b/>
-          <w:color w:val="000000" w:themeColor="text1"/>
-          <w:sz w:val="18"/>
-          <w:szCs w:val="18"/>
-        </w:rPr>
-        <w:t>React Documentation</w:t>
-      </w:r>
-      <w:r>
-        <w:rPr>
-          <w:rFonts w:cs="Arial"/>
-          <w:color w:val="000000" w:themeColor="text1"/>
-          <w:sz w:val="18"/>
-          <w:szCs w:val="18"/>
-        </w:rPr>
-        <w:t xml:space="preserve"> — </w:t>
-      </w:r>
-      <w:proofErr w:type="spellStart"/>
-      <w:r>
-        <w:rPr>
-          <w:rFonts w:cs="Arial"/>
-          <w:color w:val="000000" w:themeColor="text1"/>
-          <w:sz w:val="18"/>
-          <w:szCs w:val="18"/>
-          <w:u w:val="single"/>
-        </w:rPr>
-        <w:t>react.dev</w:t>
-      </w:r>
-      <w:proofErr w:type="spellEnd"/>
-      <w:r>
-        <w:rPr>
-          <w:rFonts w:cs="Arial"/>
-          <w:color w:val="000000" w:themeColor="text1"/>
-          <w:sz w:val="18"/>
-          <w:szCs w:val="18"/>
-        </w:rPr>
-        <w:t xml:space="preserve"> (https://react.dev)</w:t>
-      </w:r>
-    </w:p>
-    <w:p>
-      <w:pPr>
-        <w:pStyle w:val="ListNumber"/>
-        <w:spacing w:after="40"/>
-        <w:ind w:left="288"/>
-        <w:rPr>
-          <w:rFonts w:cs="Arial"/>
-          <w:color w:val="000000" w:themeColor="text1"/>
-          <w:sz w:val="18"/>
-          <w:szCs w:val="18"/>
-        </w:rPr>
-      </w:pPr>
-      <w:r>
-        <w:rPr>
-          <w:rFonts w:cs="Arial"/>
-          <w:b/>
-          <w:color w:val="000000" w:themeColor="text1"/>
-          <w:sz w:val="18"/>
-          <w:szCs w:val="18"/>
-        </w:rPr>
-        <w:t>Postman Learning Center</w:t>
-      </w:r>
-      <w:r>
-        <w:rPr>
-          <w:rFonts w:cs="Arial"/>
-          <w:color w:val="000000" w:themeColor="text1"/>
-          <w:sz w:val="18"/>
-          <w:szCs w:val="18"/>
-        </w:rPr>
-        <w:t xml:space="preserve"> — </w:t>
-      </w:r>
-      <w:r>
-        <w:rPr>
-          <w:rFonts w:cs="Arial"/>
-          <w:color w:val="000000" w:themeColor="text1"/>
-          <w:sz w:val="18"/>
-          <w:szCs w:val="18"/>
-          <w:u w:val="single"/>
-        </w:rPr>
-        <w:t>learning.postman.com</w:t>
-      </w:r>
-      <w:r>
-        <w:rPr>
-          <w:rFonts w:cs="Arial"/>
-          <w:color w:val="000000" w:themeColor="text1"/>
-          <w:sz w:val="18"/>
-          <w:szCs w:val="18"/>
-        </w:rPr>
-        <w:t xml:space="preserve"> (https://learning.postman.com)</w:t>
-      </w:r>
-    </w:p>
-    <w:p>
-      <w:pPr>
-        <w:pStyle w:val="ListNumber"/>
-        <w:spacing w:after="40"/>
-        <w:ind w:left="288"/>
-        <w:rPr>
-          <w:rFonts w:cs="Arial"/>
-          <w:color w:val="000000" w:themeColor="text1"/>
-          <w:sz w:val="18"/>
-          <w:szCs w:val="18"/>
-        </w:rPr>
-      </w:pPr>
-      <w:proofErr w:type="spellStart"/>
-      <w:r>
-        <w:rPr>
-          <w:rFonts w:cs="Arial"/>
-          <w:b/>
-          <w:color w:val="000000" w:themeColor="text1"/>
-          <w:sz w:val="18"/>
-          <w:szCs w:val="18"/>
-        </w:rPr>
-        <w:t>Docker</w:t>
-      </w:r>
-      <w:proofErr w:type="spellEnd"/>
-      <w:r>
-        <w:rPr>
-          <w:rFonts w:cs="Arial"/>
-          <w:b/>
-          <w:color w:val="000000" w:themeColor="text1"/>
-          <w:sz w:val="18"/>
-          <w:szCs w:val="18"/>
-        </w:rPr>
-        <w:t xml:space="preserve"> Documentation</w:t>
-      </w:r>
-      <w:r>
-        <w:rPr>
-          <w:rFonts w:cs="Arial"/>
-          <w:color w:val="000000" w:themeColor="text1"/>
-          <w:sz w:val="18"/>
-          <w:szCs w:val="18"/>
-        </w:rPr>
-        <w:t xml:space="preserve"> — </w:t>
-      </w:r>
-      <w:r>
-        <w:rPr>
-          <w:rFonts w:cs="Arial"/>
-          <w:color w:val="000000" w:themeColor="text1"/>
-          <w:sz w:val="18"/>
-          <w:szCs w:val="18"/>
-          <w:u w:val="single"/>
-        </w:rPr>
-        <w:t>docs.docker.com</w:t>
-      </w:r>
-      <w:r>
-        <w:rPr>
-          <w:rFonts w:cs="Arial"/>
-          <w:color w:val="000000" w:themeColor="text1"/>
-          <w:sz w:val="18"/>
-          <w:szCs w:val="18"/>
-        </w:rPr>
-        <w:t xml:space="preserve"> (https://docs.docker.com)</w:t>
-      </w:r>
-    </w:p>
-    <w:p>
-      <w:pPr>
-        <w:pStyle w:val="CustomHeading2"/>
-        <w:rPr>
-          <w:rFonts w:cs="Arial"/>
-          <w:color w:val="000000" w:themeColor="text1"/>
-          <w:sz w:val="18"/>
-          <w:szCs w:val="18"/>
-        </w:rPr>
-      </w:pPr>
-      <w:r>
-        <w:rPr>
-          <w:rFonts w:cs="Arial"/>
-          <w:color w:val="000000" w:themeColor="text1"/>
-          <w:sz w:val="18"/>
-          <w:szCs w:val="18"/>
-        </w:rPr>
-        <w:t>Free PDF Quick-Reference Books (goalkicker.com)</w:t>
-      </w:r>
-    </w:p>
-    <w:tbl>
-      <w:tblPr>
-        <w:tblW w:w="0" w:type="auto"/>
-        <w:jc w:val="center"/>
-        <w:tblBorders>
-          <w:top w:val="single" w:sz="8" w:space="0" w:color="CFCFCF"/>
-          <w:left w:val="single" w:sz="8" w:space="0" w:color="CFCFCF"/>
-          <w:bottom w:val="single" w:sz="8" w:space="0" w:color="CFCFCF"/>
-          <w:right w:val="single" w:sz="8" w:space="0" w:color="CFCFCF"/>
-          <w:insideH w:val="single" w:sz="8" w:space="0" w:color="CFCFCF"/>
-          <w:insideV w:val="single" w:sz="8" w:space="0" w:color="CFCFCF"/>
-        </w:tblBorders>
-        <w:tblLook w:val="04A0" w:firstRow="1" w:lastRow="0" w:firstColumn="1" w:lastColumn="0" w:noHBand="0" w:noVBand="1"/>
-      </w:tblPr>
-      <w:tblGrid>
-        <w:gridCol w:w="1897"/>
-        <w:gridCol w:w="6373"/>
-      </w:tblGrid>
-      <w:tr>
-        <w:trPr>
-          <w:jc w:val="center"/>
-        </w:trPr>
-        <w:tc>
-          <w:tcPr>
-            <w:tcW w:w="1897" w:type="dxa"/>
-            <w:shd w:val="clear" w:color="auto" w:fill="F5F5F5"/>
-            <w:tcMar>
-              <w:top w:w="80" w:type="dxa"/>
-              <w:left w:w="100" w:type="dxa"/>
-              <w:bottom w:w="80" w:type="dxa"/>
-              <w:right w:w="100" w:type="dxa"/>
-            </w:tcMar>
-          </w:tcPr>
-          <w:p>
-            <w:pPr>
-              <w:rPr>
-                <w:rFonts w:ascii="Arial" w:hAnsi="Arial" w:cs="Arial"/>
-                <w:color w:val="000000" w:themeColor="text1"/>
-                <w:sz w:val="18"/>
-                <w:szCs w:val="18"/>
-              </w:rPr>
-            </w:pPr>
-            <w:r>
-              <w:rPr>
-                <w:rFonts w:ascii="Arial" w:hAnsi="Arial" w:cs="Arial"/>
-                <w:b/>
-                <w:color w:val="000000" w:themeColor="text1"/>
-                <w:sz w:val="18"/>
-                <w:szCs w:val="18"/>
-              </w:rPr>
-              <w:lastRenderedPageBreak/>
-              <w:t>Topic</w:t>
-            </w:r>
-          </w:p>
-        </w:tc>
-        <w:tc>
-          <w:tcPr>
-            <w:tcW w:w="6373" w:type="dxa"/>
-            <w:shd w:val="clear" w:color="auto" w:fill="F5F5F5"/>
-            <w:tcMar>
-              <w:top w:w="80" w:type="dxa"/>
-              <w:left w:w="100" w:type="dxa"/>
-              <w:bottom w:w="80" w:type="dxa"/>
-              <w:right w:w="100" w:type="dxa"/>
-            </w:tcMar>
-          </w:tcPr>
-          <w:p>
-            <w:pPr>
-              <w:rPr>
-                <w:rFonts w:ascii="Arial" w:hAnsi="Arial" w:cs="Arial"/>
-                <w:color w:val="000000" w:themeColor="text1"/>
-                <w:sz w:val="18"/>
-                <w:szCs w:val="18"/>
-              </w:rPr>
-            </w:pPr>
-            <w:r>
-              <w:rPr>
-                <w:rFonts w:ascii="Arial" w:hAnsi="Arial" w:cs="Arial"/>
-                <w:b/>
-                <w:color w:val="000000" w:themeColor="text1"/>
-                <w:sz w:val="18"/>
-                <w:szCs w:val="18"/>
-              </w:rPr>
-              <w:t>Download</w:t>
-            </w:r>
-          </w:p>
-        </w:tc>
-      </w:tr>
-      <w:tr>
-        <w:trPr>
-          <w:jc w:val="center"/>
-        </w:trPr>
-        <w:tc>
-          <w:tcPr>
-            <w:tcW w:w="1897" w:type="dxa"/>
-            <w:tcMar>
-              <w:top w:w="80" w:type="dxa"/>
-              <w:left w:w="100" w:type="dxa"/>
-              <w:bottom w:w="80" w:type="dxa"/>
-              <w:right w:w="100" w:type="dxa"/>
-            </w:tcMar>
-          </w:tcPr>
-          <w:p>
-            <w:pPr>
-              <w:rPr>
-                <w:rFonts w:ascii="Arial" w:hAnsi="Arial" w:cs="Arial"/>
-                <w:color w:val="000000" w:themeColor="text1"/>
-                <w:sz w:val="18"/>
-                <w:szCs w:val="18"/>
-              </w:rPr>
-            </w:pPr>
-            <w:r>
-              <w:rPr>
-                <w:rFonts w:ascii="Arial" w:hAnsi="Arial" w:cs="Arial"/>
-                <w:color w:val="000000" w:themeColor="text1"/>
-                <w:sz w:val="18"/>
-                <w:szCs w:val="18"/>
-              </w:rPr>
-              <w:t>JavaScript</w:t>
-            </w:r>
-          </w:p>
-        </w:tc>
-        <w:tc>
-          <w:tcPr>
-            <w:tcW w:w="6373" w:type="dxa"/>
-            <w:tcMar>
-              <w:top w:w="80" w:type="dxa"/>
-              <w:left w:w="100" w:type="dxa"/>
-              <w:bottom w:w="80" w:type="dxa"/>
-              <w:right w:w="100" w:type="dxa"/>
-            </w:tcMar>
-          </w:tcPr>
-          <w:p>
-            <w:pPr>
-              <w:rPr>
-                <w:rFonts w:ascii="Arial" w:hAnsi="Arial" w:cs="Arial"/>
-                <w:color w:val="000000" w:themeColor="text1"/>
-                <w:sz w:val="18"/>
-                <w:szCs w:val="18"/>
-              </w:rPr>
-            </w:pPr>
-            <w:r>
-              <w:rPr>
-                <w:rFonts w:ascii="Arial" w:hAnsi="Arial" w:cs="Arial"/>
-                <w:color w:val="000000" w:themeColor="text1"/>
-                <w:sz w:val="18"/>
-                <w:szCs w:val="18"/>
-                <w:u w:val="single"/>
-              </w:rPr>
-              <w:t>JavaScript Notes for Professionals (PDF)</w:t>
-            </w:r>
-            <w:r>
-              <w:rPr>
-                <w:rFonts w:ascii="Arial" w:hAnsi="Arial" w:cs="Arial"/>
-                <w:color w:val="000000" w:themeColor="text1"/>
-                <w:sz w:val="18"/>
-                <w:szCs w:val="18"/>
-              </w:rPr>
-              <w:t xml:space="preserve"> (https://goalkicker.com/JavaScriptBook/JavaScriptNotesForProfessionals.pdf)</w:t>
-            </w:r>
-          </w:p>
-        </w:tc>
-      </w:tr>
-      <w:tr>
-        <w:trPr>
-          <w:jc w:val="center"/>
-        </w:trPr>
-        <w:tc>
-          <w:tcPr>
-            <w:tcW w:w="1897" w:type="dxa"/>
-            <w:tcMar>
-              <w:top w:w="80" w:type="dxa"/>
-              <w:left w:w="100" w:type="dxa"/>
-              <w:bottom w:w="80" w:type="dxa"/>
-              <w:right w:w="100" w:type="dxa"/>
-            </w:tcMar>
-          </w:tcPr>
-          <w:p>
-            <w:pPr>
-              <w:rPr>
-                <w:rFonts w:ascii="Arial" w:hAnsi="Arial" w:cs="Arial"/>
-                <w:color w:val="000000" w:themeColor="text1"/>
-                <w:sz w:val="18"/>
-                <w:szCs w:val="18"/>
-              </w:rPr>
-            </w:pPr>
-            <w:r>
-              <w:rPr>
-                <w:rFonts w:ascii="Arial" w:hAnsi="Arial" w:cs="Arial"/>
-                <w:color w:val="000000" w:themeColor="text1"/>
-                <w:sz w:val="18"/>
-                <w:szCs w:val="18"/>
-              </w:rPr>
-              <w:t>Node.js</w:t>
-            </w:r>
-          </w:p>
-        </w:tc>
-        <w:tc>
-          <w:tcPr>
-            <w:tcW w:w="6373" w:type="dxa"/>
-            <w:tcMar>
-              <w:top w:w="80" w:type="dxa"/>
-              <w:left w:w="100" w:type="dxa"/>
-              <w:bottom w:w="80" w:type="dxa"/>
-              <w:right w:w="100" w:type="dxa"/>
-            </w:tcMar>
-          </w:tcPr>
-          <w:p>
-            <w:pPr>
-              <w:rPr>
-                <w:rFonts w:ascii="Arial" w:hAnsi="Arial" w:cs="Arial"/>
-                <w:color w:val="000000" w:themeColor="text1"/>
-                <w:sz w:val="18"/>
-                <w:szCs w:val="18"/>
-              </w:rPr>
-            </w:pPr>
-            <w:r>
-              <w:rPr>
-                <w:rFonts w:ascii="Arial" w:hAnsi="Arial" w:cs="Arial"/>
-                <w:color w:val="000000" w:themeColor="text1"/>
-                <w:sz w:val="18"/>
-                <w:szCs w:val="18"/>
-                <w:u w:val="single"/>
-              </w:rPr>
-              <w:t>Node.js Notes for Professionals (PDF)</w:t>
-            </w:r>
-            <w:r>
-              <w:rPr>
-                <w:rFonts w:ascii="Arial" w:hAnsi="Arial" w:cs="Arial"/>
-                <w:color w:val="000000" w:themeColor="text1"/>
-                <w:sz w:val="18"/>
-                <w:szCs w:val="18"/>
-              </w:rPr>
-              <w:t xml:space="preserve"> (https://goalkicker.com/NodeJSBook/NodeJSNotesForProfessionals.pdf)</w:t>
-            </w:r>
-          </w:p>
-        </w:tc>
-      </w:tr>
-      <w:tr>
-        <w:trPr>
-          <w:jc w:val="center"/>
-        </w:trPr>
-        <w:tc>
-          <w:tcPr>
-            <w:tcW w:w="1897" w:type="dxa"/>
-            <w:tcMar>
-              <w:top w:w="80" w:type="dxa"/>
-              <w:left w:w="100" w:type="dxa"/>
-              <w:bottom w:w="80" w:type="dxa"/>
-              <w:right w:w="100" w:type="dxa"/>
-            </w:tcMar>
-          </w:tcPr>
-          <w:p>
-            <w:pPr>
-              <w:rPr>
-                <w:rFonts w:ascii="Arial" w:hAnsi="Arial" w:cs="Arial"/>
-                <w:color w:val="000000" w:themeColor="text1"/>
-                <w:sz w:val="18"/>
-                <w:szCs w:val="18"/>
-              </w:rPr>
-            </w:pPr>
-            <w:r>
-              <w:rPr>
-                <w:rFonts w:ascii="Arial" w:hAnsi="Arial" w:cs="Arial"/>
-                <w:color w:val="000000" w:themeColor="text1"/>
-                <w:sz w:val="18"/>
-                <w:szCs w:val="18"/>
-              </w:rPr>
-              <w:t>PHP</w:t>
-            </w:r>
-          </w:p>
-        </w:tc>
-        <w:tc>
-          <w:tcPr>
-            <w:tcW w:w="6373" w:type="dxa"/>
-            <w:tcMar>
-              <w:top w:w="80" w:type="dxa"/>
-              <w:left w:w="100" w:type="dxa"/>
-              <w:bottom w:w="80" w:type="dxa"/>
-              <w:right w:w="100" w:type="dxa"/>
-            </w:tcMar>
-          </w:tcPr>
-          <w:p>
-            <w:pPr>
-              <w:rPr>
-                <w:rFonts w:ascii="Arial" w:hAnsi="Arial" w:cs="Arial"/>
-                <w:color w:val="000000" w:themeColor="text1"/>
-                <w:sz w:val="18"/>
-                <w:szCs w:val="18"/>
-              </w:rPr>
-            </w:pPr>
-            <w:r>
-              <w:rPr>
-                <w:rFonts w:ascii="Arial" w:hAnsi="Arial" w:cs="Arial"/>
-                <w:color w:val="000000" w:themeColor="text1"/>
-                <w:sz w:val="18"/>
-                <w:szCs w:val="18"/>
-                <w:u w:val="single"/>
-              </w:rPr>
-              <w:t>PHP Notes for Professionals (PDF)</w:t>
-            </w:r>
-            <w:r>
-              <w:rPr>
-                <w:rFonts w:ascii="Arial" w:hAnsi="Arial" w:cs="Arial"/>
-                <w:color w:val="000000" w:themeColor="text1"/>
-                <w:sz w:val="18"/>
-                <w:szCs w:val="18"/>
-              </w:rPr>
-              <w:t xml:space="preserve"> (https://goalkicker.com/PHPBook/PHPNotesForProfessionals.pdf)</w:t>
-            </w:r>
-          </w:p>
-        </w:tc>
-      </w:tr>
-      <w:tr>
-        <w:trPr>
-          <w:jc w:val="center"/>
-        </w:trPr>
-        <w:tc>
-          <w:tcPr>
-            <w:tcW w:w="1897" w:type="dxa"/>
-            <w:tcMar>
-              <w:top w:w="80" w:type="dxa"/>
-              <w:left w:w="100" w:type="dxa"/>
-              <w:bottom w:w="80" w:type="dxa"/>
-              <w:right w:w="100" w:type="dxa"/>
-            </w:tcMar>
-          </w:tcPr>
-          <w:p>
-            <w:pPr>
-              <w:rPr>
-                <w:rFonts w:ascii="Arial" w:hAnsi="Arial" w:cs="Arial"/>
-                <w:color w:val="000000" w:themeColor="text1"/>
-                <w:sz w:val="18"/>
-                <w:szCs w:val="18"/>
-              </w:rPr>
-            </w:pPr>
-            <w:proofErr w:type="spellStart"/>
-            <w:r>
-              <w:rPr>
-                <w:rFonts w:ascii="Arial" w:hAnsi="Arial" w:cs="Arial"/>
-                <w:color w:val="000000" w:themeColor="text1"/>
-                <w:sz w:val="18"/>
-                <w:szCs w:val="18"/>
-              </w:rPr>
-              <w:t>Git</w:t>
-            </w:r>
-            <w:proofErr w:type="spellEnd"/>
-          </w:p>
-        </w:tc>
-        <w:tc>
-          <w:tcPr>
-            <w:tcW w:w="6373" w:type="dxa"/>
-            <w:tcMar>
-              <w:top w:w="80" w:type="dxa"/>
-              <w:left w:w="100" w:type="dxa"/>
-              <w:bottom w:w="80" w:type="dxa"/>
-              <w:right w:w="100" w:type="dxa"/>
-            </w:tcMar>
-          </w:tcPr>
-          <w:p>
-            <w:pPr>
-              <w:rPr>
-                <w:rFonts w:ascii="Arial" w:hAnsi="Arial" w:cs="Arial"/>
-                <w:color w:val="000000" w:themeColor="text1"/>
-                <w:sz w:val="18"/>
-                <w:szCs w:val="18"/>
-              </w:rPr>
-            </w:pPr>
-            <w:proofErr w:type="spellStart"/>
-            <w:r>
-              <w:rPr>
-                <w:rFonts w:ascii="Arial" w:hAnsi="Arial" w:cs="Arial"/>
-                <w:color w:val="000000" w:themeColor="text1"/>
-                <w:sz w:val="18"/>
-                <w:szCs w:val="18"/>
-                <w:u w:val="single"/>
-              </w:rPr>
-              <w:t>Git</w:t>
-            </w:r>
-            <w:proofErr w:type="spellEnd"/>
-            <w:r>
-              <w:rPr>
-                <w:rFonts w:ascii="Arial" w:hAnsi="Arial" w:cs="Arial"/>
-                <w:color w:val="000000" w:themeColor="text1"/>
-                <w:sz w:val="18"/>
-                <w:szCs w:val="18"/>
-                <w:u w:val="single"/>
-              </w:rPr>
-              <w:t xml:space="preserve"> Notes for Professionals (PDF)</w:t>
-            </w:r>
-            <w:r>
-              <w:rPr>
-                <w:rFonts w:ascii="Arial" w:hAnsi="Arial" w:cs="Arial"/>
-                <w:color w:val="000000" w:themeColor="text1"/>
-                <w:sz w:val="18"/>
-                <w:szCs w:val="18"/>
-              </w:rPr>
-              <w:t xml:space="preserve"> (https://goalkicker.com/GitBook/GitNotesForProfessionals.pdf)</w:t>
-            </w:r>
-          </w:p>
-        </w:tc>
-      </w:tr>
-    </w:tbl>
     <w:p>
       <w:pPr>
         <w:rPr>

</xml_diff>

<commit_message>
Shorten CSE 3252 lab headings in print draft
</commit_message>
<xml_diff>
--- a/58-CSE 3252_U.docx
+++ b/58-CSE 3252_U.docx
@@ -3140,7 +3140,7 @@
           <w:sz w:val="18"/>
           <w:szCs w:val="18"/>
         </w:rPr>
-        <w:t>Lab 1 — Environment Setup and Full-Stack Project Structure</w:t>
+        <w:t>Lab 1 — Environment Setup and Project Structure</w:t>
       </w:r>
     </w:p>
     <w:p>
@@ -3161,7 +3161,7 @@
           <w:sz w:val="18"/>
           <w:szCs w:val="18"/>
         </w:rPr>
-        <w:t>Lab 2 — Server-Side Framework Fundamentals and Database Migrations</w:t>
+        <w:t>Lab 2 — Backend Framework Basics and Database Migrations</w:t>
       </w:r>
     </w:p>
     <w:p>
@@ -3182,7 +3182,7 @@
           <w:sz w:val="18"/>
           <w:szCs w:val="18"/>
         </w:rPr>
-        <w:t>Lab 3 — REST API Development and Testing with Postman</w:t>
+        <w:t>Lab 3 — REST API Development with Postman</w:t>
       </w:r>
     </w:p>
     <w:p>
@@ -3203,7 +3203,7 @@
           <w:sz w:val="18"/>
           <w:szCs w:val="18"/>
         </w:rPr>
-        <w:t>Lab 4 — Comparative Implementation in an Alternative Backend Framework (Optional)</w:t>
+        <w:t>Lab 4 — Alternative Backend Framework (Optional)</w:t>
       </w:r>
     </w:p>
     <w:p>
@@ -3224,7 +3224,7 @@
           <w:sz w:val="18"/>
           <w:szCs w:val="18"/>
         </w:rPr>
-        <w:t>Lab 5 — Authentication and Role-Based Authorization</w:t>
+        <w:t>Lab 5 — Authentication and Role-Based Access</w:t>
       </w:r>
     </w:p>
     <w:p>
@@ -3245,7 +3245,7 @@
           <w:sz w:val="18"/>
           <w:szCs w:val="18"/>
         </w:rPr>
-        <w:t>Lab 6 — React Frontend Integration with Backend APIs</w:t>
+        <w:t>Lab 6 — React–API Integration</w:t>
       </w:r>
     </w:p>
     <w:p>
@@ -3351,7 +3351,7 @@
           <w:sz w:val="18"/>
           <w:szCs w:val="18"/>
         </w:rPr>
-        <w:t xml:space="preserve"> and Capstone Full-Stack Project</w:t>
+        <w:t xml:space="preserve"> and Capstone Project</w:t>
       </w:r>
     </w:p>
     <w:p>

</xml_diff>

<commit_message>
Drop optional Lab 4 from CSE 3252 and renumber labs
- Print draft: remove Lab 4 (Alternative Backend Framework) and renumber Labs 5-10 as 4-9
- Markdown: renumber labs to match and keep the alternative framework lab as an unnumbered Optional Extension
</commit_message>
<xml_diff>
--- a/58-CSE 3252_U.docx
+++ b/58-CSE 3252_U.docx
@@ -3203,7 +3203,7 @@
           <w:sz w:val="18"/>
           <w:szCs w:val="18"/>
         </w:rPr>
-        <w:t>Lab 4 — Alternative Backend Framework (Optional)</w:t>
+        <w:t>Lab 4 — Authentication and Role-Based Access</w:t>
       </w:r>
     </w:p>
     <w:p>
@@ -3224,7 +3224,7 @@
           <w:sz w:val="18"/>
           <w:szCs w:val="18"/>
         </w:rPr>
-        <w:t>Lab 5 — Authentication and Role-Based Access</w:t>
+        <w:t>Lab 5 — React–API Integration</w:t>
       </w:r>
     </w:p>
     <w:p>
@@ -3245,7 +3245,7 @@
           <w:sz w:val="18"/>
           <w:szCs w:val="18"/>
         </w:rPr>
-        <w:t>Lab 6 — React–API Integration</w:t>
+        <w:t>Lab 6 — Full-Stack CRUD Module</w:t>
       </w:r>
     </w:p>
     <w:p>
@@ -3266,7 +3266,7 @@
           <w:sz w:val="18"/>
           <w:szCs w:val="18"/>
         </w:rPr>
-        <w:t>Lab 7 — Full-Stack CRUD Module</w:t>
+        <w:t>Lab 7 — File Uploads, Security, and Validation</w:t>
       </w:r>
     </w:p>
     <w:p>
@@ -3287,7 +3287,7 @@
           <w:sz w:val="18"/>
           <w:szCs w:val="18"/>
         </w:rPr>
-        <w:t>Lab 8 — File Uploads, Security, and Validation</w:t>
+        <w:t>Lab 8 — Testing, Debugging, and API Documentation</w:t>
       </w:r>
     </w:p>
     <w:p>
@@ -3308,28 +3308,7 @@
           <w:sz w:val="18"/>
           <w:szCs w:val="18"/>
         </w:rPr>
-        <w:t>Lab 9 — Testing, Debugging, and API Documentation</w:t>
-      </w:r>
-    </w:p>
-    <w:p>
-      <w:pPr>
-        <w:rPr>
-          <w:rFonts w:ascii="Arial" w:hAnsi="Arial" w:cs="Arial"/>
-          <w:b/>
-          <w:bCs/>
-          <w:sz w:val="18"/>
-          <w:szCs w:val="18"/>
-        </w:rPr>
-      </w:pPr>
-      <w:r>
-        <w:rPr>
-          <w:rFonts w:ascii="Arial" w:hAnsi="Arial" w:cs="Arial"/>
-          <w:b/>
-          <w:bCs/>
-          <w:sz w:val="18"/>
-          <w:szCs w:val="18"/>
-        </w:rPr>
-        <w:t xml:space="preserve">Lab 10 — </w:t>
+        <w:t xml:space="preserve">Lab 9 — </w:t>
       </w:r>
       <w:proofErr w:type="spellStart"/>
       <w:r>

</xml_diff>